<commit_message>
Declara los documentos de Office como binarios y renormaliza docs
</commit_message>
<xml_diff>
--- a/docs/Gutierrez_Perfil_Proyecto_v1.docx
+++ b/docs/Gutierrez_Perfil_Proyecto_v1.docx
@@ -14337,23 +14337,6 @@
       </w:r>
       <w:r>
         <w:t xml:space="preserve"> [en línea]. OpenID Foundation, 15 de diciembre de 2023 [consulta: 18 de septiembre de 2026]. Disponible en: https://openid.net/specs/openid-connect-core-1_0.html</w:t>
-      </w:r>
-    </w:p>
-    <w:p>
-      <w:pPr>
-        <w:jc w:val="both"/>
-      </w:pPr>
-      <w:r>
-        <w:t xml:space="preserve">Los datos de operación del negocio proceden de una entrevista presencial y se citan dentro del texto como </w:t>
-      </w:r>
-      <w:r>
-        <w:rPr>
-          <w:i/>
-        </w:rPr>
-        <w:t>(Entrevista a Herlinda Duran, dueña de Max Pizzas, 18 de septiembre de 2026)</w:t>
-      </w:r>
-      <w:r>
-        <w:t>. Conforme a la norma, las comunicaciones personales no se incorporan a la bibliografía.</w:t>
       </w:r>
     </w:p>
     <w:p>

</xml_diff>